<commit_message>
Nom d'auteur (Loïg Kerdraon) sur la page de titre et dans les métadonnées EPUB
Co-Authored-By: Claude Opus 5.5 <noreply@anthropic.com>
Claude-Session: https://claude.ai/code/session_019M4foyq87Zm718jiSc4m96
</commit_message>
<xml_diff>
--- a/sortie/roman.docx
+++ b/sortie/roman.docx
@@ -28,6 +28,20 @@
       </w:pPr>
       <w:r>
         <w:t xml:space="preserve">roman</w:t>
+      </w:r>
+    </w:p>
+    <w:p>
+      <w:pPr>
+        <w:pStyle w:val="Author"/>
+      </w:pPr>
+      <w:r>
+        <w:t xml:space="preserve">Loïg</w:t>
+      </w:r>
+      <w:r>
+        <w:t xml:space="preserve"> </w:t>
+      </w:r>
+      <w:r>
+        <w:t xml:space="preserve">Kerdraon</w:t>
       </w:r>
     </w:p>
     <w:bookmarkStart w:id="20" w:name="prologue"/>
@@ -28959,8 +28973,14 @@
     <w:pPr>
       <w:keepNext/>
       <w:keepLines/>
+      <w:spacing w:before="2268"/>
       <w:jc w:val="center"/>
     </w:pPr>
+    <w:rPr>
+      <w:rFonts w:ascii="EB Garamond" w:cs="EB Garamond" w:eastAsia="EB Garamond" w:hAnsi="EB Garamond"/>
+      <w:b w:val="0"/>
+      <w:sz w:val="26"/>
+    </w:rPr>
   </w:style>
   <w:style w:styleId="Date" w:type="paragraph">
     <w:name w:val="Date"/>

</xml_diff>